<commit_message>
Update MLOps supporting report
</commit_message>
<xml_diff>
--- a/reports/documentation/MLOps_Heart_Disease_Supporting_Report.docx
+++ b/reports/documentation/MLOps_Heart_Disease_Supporting_Report.docx
@@ -54,31 +54,12 @@
           <w:sz w:val="24"/>
           <w:szCs w:val="24"/>
         </w:rPr>
-        <w:t xml:space="preserve">Course: </w:t>
-      </w:r>
-      <w:proofErr w:type="spellStart"/>
-      <w:r>
-        <w:rPr>
-          <w:sz w:val="24"/>
-          <w:szCs w:val="24"/>
-        </w:rPr>
-        <w:t>MLOps</w:t>
-      </w:r>
-      <w:proofErr w:type="spellEnd"/>
-      <w:r>
-        <w:rPr>
-          <w:sz w:val="24"/>
-          <w:szCs w:val="24"/>
-        </w:rPr>
-        <w:t xml:space="preserve"> AIMLZG523</w:t>
+        <w:t>Course: MLOps AIMLZG523</w:t>
       </w:r>
     </w:p>
     <w:p>
       <w:pPr>
         <w:jc w:val="center"/>
-        <w:rPr>
-          <w:sz w:val="22"/>
-        </w:rPr>
       </w:pPr>
       <w:r>
         <w:rPr>
@@ -93,33 +74,8 @@
           <w:szCs w:val="24"/>
         </w:rPr>
         <w:br/>
-        <w:t xml:space="preserve">Student: </w:t>
+        <w:t>Student: Kartiki Vijaykumar Khoje</w:t>
       </w:r>
-      <w:proofErr w:type="spellStart"/>
-      <w:r>
-        <w:rPr>
-          <w:sz w:val="24"/>
-          <w:szCs w:val="24"/>
-        </w:rPr>
-        <w:t>Kartiki</w:t>
-      </w:r>
-      <w:proofErr w:type="spellEnd"/>
-      <w:r>
-        <w:rPr>
-          <w:sz w:val="24"/>
-          <w:szCs w:val="24"/>
-        </w:rPr>
-        <w:t xml:space="preserve"> Vijaykumar </w:t>
-      </w:r>
-      <w:proofErr w:type="spellStart"/>
-      <w:r>
-        <w:rPr>
-          <w:sz w:val="24"/>
-          <w:szCs w:val="24"/>
-        </w:rPr>
-        <w:t>Khoje</w:t>
-      </w:r>
-      <w:proofErr w:type="spellEnd"/>
       <w:r>
         <w:rPr>
           <w:sz w:val="24"/>
@@ -144,6 +100,45 @@
           <w:t>https://github.com/3121kartikikhoje/MLOps-Heart-Disease-Project</w:t>
         </w:r>
       </w:hyperlink>
+    </w:p>
+    <w:p>
+      <w:pPr>
+        <w:jc w:val="center"/>
+        <w:rPr>
+          <w:sz w:val="22"/>
+        </w:rPr>
+      </w:pPr>
+    </w:p>
+    <w:p>
+      <w:pPr>
+        <w:jc w:val="center"/>
+        <w:rPr>
+          <w:sz w:val="22"/>
+        </w:rPr>
+      </w:pPr>
+      <w:r>
+        <w:rPr>
+          <w:sz w:val="22"/>
+        </w:rPr>
+        <w:t xml:space="preserve">Git link - </w:t>
+      </w:r>
+      <w:hyperlink r:id="rId9" w:history="1">
+        <w:r>
+          <w:rPr>
+            <w:rStyle w:val="Hyperlink"/>
+            <w:sz w:val="22"/>
+          </w:rPr>
+          <w:t>https://github.com/3121kartikikhoje/MLOps-Heart-Disease-Project.git</w:t>
+        </w:r>
+      </w:hyperlink>
+    </w:p>
+    <w:p>
+      <w:pPr>
+        <w:jc w:val="center"/>
+        <w:rPr>
+          <w:sz w:val="22"/>
+        </w:rPr>
+      </w:pPr>
     </w:p>
     <w:p>
       <w:pPr>
@@ -325,7 +320,7 @@
                     <pic:cNvPicPr/>
                   </pic:nvPicPr>
                   <pic:blipFill>
-                    <a:blip r:embed="rId9"/>
+                    <a:blip r:embed="rId10"/>
                     <a:stretch>
                       <a:fillRect/>
                     </a:stretch>
@@ -512,7 +507,7 @@
                     <pic:cNvPicPr/>
                   </pic:nvPicPr>
                   <pic:blipFill>
-                    <a:blip r:embed="rId10"/>
+                    <a:blip r:embed="rId11"/>
                     <a:stretch>
                       <a:fillRect/>
                     </a:stretch>
@@ -657,21 +652,7 @@
         <w:rPr>
           <w:sz w:val="22"/>
         </w:rPr>
-        <w:t>Target conversion: (target &gt; 0</w:t>
-      </w:r>
-      <w:proofErr w:type="gramStart"/>
-      <w:r>
-        <w:rPr>
-          <w:sz w:val="22"/>
-        </w:rPr>
-        <w:t>).astype</w:t>
-      </w:r>
-      <w:proofErr w:type="gramEnd"/>
-      <w:r>
-        <w:rPr>
-          <w:sz w:val="22"/>
-        </w:rPr>
-        <w:t>(int), after dropping rows with a missing target.</w:t>
+        <w:t>Target conversion: (target &gt; 0).astype(int), after dropping rows with a missing target.</w:t>
       </w:r>
     </w:p>
     <w:p>
@@ -715,7 +696,7 @@
                     <pic:cNvPicPr/>
                   </pic:nvPicPr>
                   <pic:blipFill>
-                    <a:blip r:embed="rId11"/>
+                    <a:blip r:embed="rId12"/>
                     <a:stretch>
                       <a:fillRect/>
                     </a:stretch>
@@ -741,15 +722,7 @@
         <w:pStyle w:val="Heading1"/>
       </w:pPr>
       <w:r>
-        <w:t xml:space="preserve">4. Data quality and </w:t>
-      </w:r>
-      <w:proofErr w:type="gramStart"/>
-      <w:r>
-        <w:t>exploratory</w:t>
-      </w:r>
-      <w:proofErr w:type="gramEnd"/>
-      <w:r>
-        <w:t xml:space="preserve"> analysis</w:t>
+        <w:t>4. Data quality and exploratory analysis</w:t>
       </w:r>
     </w:p>
     <w:p>
@@ -888,21 +861,7 @@
         <w:rPr>
           <w:sz w:val="22"/>
         </w:rPr>
-        <w:t xml:space="preserve">The project uses a scikit-learn ColumnTransformer inside a Pipeline, so each cross-validation fold fits preprocessing using that fold's training partition. This is a practical way to reduce </w:t>
-      </w:r>
-      <w:proofErr w:type="gramStart"/>
-      <w:r>
-        <w:rPr>
-          <w:sz w:val="22"/>
-        </w:rPr>
-        <w:t>preprocessing</w:t>
-      </w:r>
-      <w:proofErr w:type="gramEnd"/>
-      <w:r>
-        <w:rPr>
-          <w:sz w:val="22"/>
-        </w:rPr>
-        <w:t xml:space="preserve"> leakage.</w:t>
+        <w:t>The project uses a scikit-learn ColumnTransformer inside a Pipeline, so each cross-validation fold fits preprocessing using that fold's training partition. This is a practical way to reduce preprocessing leakage.</w:t>
       </w:r>
     </w:p>
     <w:p>
@@ -962,21 +921,7 @@
         <w:rPr>
           <w:sz w:val="22"/>
         </w:rPr>
-        <w:t xml:space="preserve">Cross-validation: </w:t>
-      </w:r>
-      <w:proofErr w:type="gramStart"/>
-      <w:r>
-        <w:rPr>
-          <w:sz w:val="22"/>
-        </w:rPr>
-        <w:t>StratifiedKFold(</w:t>
-      </w:r>
-      <w:proofErr w:type="gramEnd"/>
-      <w:r>
-        <w:rPr>
-          <w:sz w:val="22"/>
-        </w:rPr>
-        <w:t>n_splits=5, shuffle=True, random_state=42).</w:t>
+        <w:t>Cross-validation: StratifiedKFold(n_splits=5, shuffle=True, random_state=42).</w:t>
       </w:r>
     </w:p>
     <w:p>
@@ -1006,16 +951,8 @@
         <w:rPr>
           <w:sz w:val="22"/>
         </w:rPr>
-        <w:t xml:space="preserve">Logistic Regression: max_iter=2000, class_weight='balanced'; C ∈ {0.1, 1.0, </w:t>
+        <w:t>Logistic Regression: max_iter=2000, class_weight='balanced'; C ∈ {0.1, 1.0, 10.0}.</w:t>
       </w:r>
-      <w:proofErr w:type="gramStart"/>
-      <w:r>
-        <w:rPr>
-          <w:sz w:val="22"/>
-        </w:rPr>
-        <w:t>10.0}.</w:t>
-      </w:r>
-      <w:proofErr w:type="gramEnd"/>
     </w:p>
     <w:p>
       <w:pPr>
@@ -1029,30 +966,8 @@
         <w:rPr>
           <w:sz w:val="22"/>
         </w:rPr>
-        <w:t xml:space="preserve">Random Forest: random_state=42, class_weight='balanced'; n_estimators ∈ {100, </w:t>
+        <w:t>Random Forest: random_state=42, class_weight='balanced'; n_estimators ∈ {100, 200}, max_depth ∈ {None, 5, 10}.</w:t>
       </w:r>
-      <w:proofErr w:type="gramStart"/>
-      <w:r>
-        <w:rPr>
-          <w:sz w:val="22"/>
-        </w:rPr>
-        <w:t>200},</w:t>
-      </w:r>
-      <w:proofErr w:type="gramEnd"/>
-      <w:r>
-        <w:rPr>
-          <w:sz w:val="22"/>
-        </w:rPr>
-        <w:t xml:space="preserve"> max_depth ∈ {None, 5, </w:t>
-      </w:r>
-      <w:proofErr w:type="gramStart"/>
-      <w:r>
-        <w:rPr>
-          <w:sz w:val="22"/>
-        </w:rPr>
-        <w:t>10}.</w:t>
-      </w:r>
-      <w:proofErr w:type="gramEnd"/>
     </w:p>
     <w:p>
       <w:pPr>
@@ -1066,21 +981,7 @@
         <w:rPr>
           <w:sz w:val="22"/>
         </w:rPr>
-        <w:t>Selection: the candidate with higher held-out test ROC-AUC is saved as artifacts/</w:t>
-      </w:r>
-      <w:proofErr w:type="spellStart"/>
-      <w:r>
-        <w:rPr>
-          <w:sz w:val="22"/>
-        </w:rPr>
-        <w:t>model.joblib</w:t>
-      </w:r>
-      <w:proofErr w:type="spellEnd"/>
-      <w:r>
-        <w:rPr>
-          <w:sz w:val="22"/>
-        </w:rPr>
-        <w:t>.</w:t>
+        <w:t>Selection: the candidate with higher held-out test ROC-AUC is saved as artifacts/model.joblib.</w:t>
       </w:r>
     </w:p>
     <w:p>
@@ -1124,7 +1025,7 @@
                     <pic:cNvPicPr/>
                   </pic:nvPicPr>
                   <pic:blipFill>
-                    <a:blip r:embed="rId12"/>
+                    <a:blip r:embed="rId13"/>
                     <a:stretch>
                       <a:fillRect/>
                     </a:stretch>
@@ -1707,7 +1608,7 @@
                     <pic:cNvPicPr/>
                   </pic:nvPicPr>
                   <pic:blipFill rotWithShape="1">
-                    <a:blip r:embed="rId13"/>
+                    <a:blip r:embed="rId14"/>
                     <a:srcRect t="9275"/>
                     <a:stretch>
                       <a:fillRect/>
@@ -1896,7 +1797,7 @@
                     <pic:cNvPicPr/>
                   </pic:nvPicPr>
                   <pic:blipFill>
-                    <a:blip r:embed="rId14"/>
+                    <a:blip r:embed="rId15"/>
                     <a:stretch>
                       <a:fillRect/>
                     </a:stretch>
@@ -1947,7 +1848,7 @@
                     <pic:cNvPicPr/>
                   </pic:nvPicPr>
                   <pic:blipFill>
-                    <a:blip r:embed="rId15"/>
+                    <a:blip r:embed="rId16"/>
                     <a:stretch>
                       <a:fillRect/>
                     </a:stretch>
@@ -2182,35 +2083,7 @@
         <w:rPr>
           <w:sz w:val="22"/>
         </w:rPr>
-        <w:t>Docker image: heart-disease-</w:t>
-      </w:r>
-      <w:proofErr w:type="gramStart"/>
-      <w:r>
-        <w:rPr>
-          <w:sz w:val="22"/>
-        </w:rPr>
-        <w:t>api:latest</w:t>
-      </w:r>
-      <w:proofErr w:type="gramEnd"/>
-      <w:r>
-        <w:rPr>
-          <w:sz w:val="22"/>
-        </w:rPr>
-        <w:t>. Build command: docker build -t heart-disease-</w:t>
-      </w:r>
-      <w:proofErr w:type="gramStart"/>
-      <w:r>
-        <w:rPr>
-          <w:sz w:val="22"/>
-        </w:rPr>
-        <w:t>api:latest</w:t>
-      </w:r>
-      <w:proofErr w:type="gramEnd"/>
-      <w:r>
-        <w:rPr>
-          <w:sz w:val="22"/>
-        </w:rPr>
-        <w:t xml:space="preserve"> .</w:t>
+        <w:t>Docker image: heart-disease-api:latest. Build command: docker build -t heart-disease-api:latest .</w:t>
       </w:r>
     </w:p>
     <w:p>
@@ -2435,7 +2308,7 @@
                     <pic:cNvPicPr/>
                   </pic:nvPicPr>
                   <pic:blipFill rotWithShape="1">
-                    <a:blip r:embed="rId16"/>
+                    <a:blip r:embed="rId17"/>
                     <a:srcRect b="52971"/>
                     <a:stretch>
                       <a:fillRect/>
@@ -2496,71 +2369,6 @@
                     <pic:cNvPicPr/>
                   </pic:nvPicPr>
                   <pic:blipFill>
-                    <a:blip r:embed="rId17"/>
-                    <a:stretch>
-                      <a:fillRect/>
-                    </a:stretch>
-                  </pic:blipFill>
-                  <pic:spPr>
-                    <a:xfrm>
-                      <a:off x="0" y="0"/>
-                      <a:ext cx="6455410" cy="4032250"/>
-                    </a:xfrm>
-                    <a:prstGeom prst="rect">
-                      <a:avLst/>
-                    </a:prstGeom>
-                  </pic:spPr>
-                </pic:pic>
-              </a:graphicData>
-            </a:graphic>
-          </wp:inline>
-        </w:drawing>
-      </w:r>
-    </w:p>
-    <w:p>
-      <w:pPr>
-        <w:pStyle w:val="ListBullet"/>
-        <w:numPr>
-          <w:ilvl w:val="0"/>
-          <w:numId w:val="0"/>
-        </w:numPr>
-        <w:spacing w:after="40"/>
-        <w:ind w:left="360" w:hanging="360"/>
-        <w:rPr>
-          <w:noProof/>
-        </w:rPr>
-      </w:pPr>
-    </w:p>
-    <w:p>
-      <w:pPr>
-        <w:pStyle w:val="ListBullet"/>
-        <w:numPr>
-          <w:ilvl w:val="0"/>
-          <w:numId w:val="0"/>
-        </w:numPr>
-        <w:spacing w:after="40"/>
-        <w:ind w:left="360" w:hanging="360"/>
-      </w:pPr>
-      <w:r>
-        <w:rPr>
-          <w:noProof/>
-        </w:rPr>
-        <w:drawing>
-          <wp:inline distT="0" distB="0" distL="0" distR="0" wp14:anchorId="1FF7C974" wp14:editId="7F6B4F19">
-            <wp:extent cx="6455410" cy="4032250"/>
-            <wp:effectExtent l="0" t="0" r="2540" b="6350"/>
-            <wp:docPr id="1114742630" name="Picture 10"/>
-            <wp:cNvGraphicFramePr>
-              <a:graphicFrameLocks xmlns:a="http://schemas.openxmlformats.org/drawingml/2006/main" noChangeAspect="1"/>
-            </wp:cNvGraphicFramePr>
-            <a:graphic xmlns:a="http://schemas.openxmlformats.org/drawingml/2006/main">
-              <a:graphicData uri="http://schemas.openxmlformats.org/drawingml/2006/picture">
-                <pic:pic xmlns:pic="http://schemas.openxmlformats.org/drawingml/2006/picture">
-                  <pic:nvPicPr>
-                    <pic:cNvPr id="1114742630" name="Picture 1114742630"/>
-                    <pic:cNvPicPr/>
-                  </pic:nvPicPr>
-                  <pic:blipFill>
                     <a:blip r:embed="rId18"/>
                     <a:stretch>
                       <a:fillRect/>
@@ -2610,6 +2418,71 @@
         <w:rPr>
           <w:noProof/>
         </w:rPr>
+        <w:drawing>
+          <wp:inline distT="0" distB="0" distL="0" distR="0" wp14:anchorId="1FF7C974" wp14:editId="7F6B4F19">
+            <wp:extent cx="6455410" cy="4032250"/>
+            <wp:effectExtent l="0" t="0" r="2540" b="6350"/>
+            <wp:docPr id="1114742630" name="Picture 10"/>
+            <wp:cNvGraphicFramePr>
+              <a:graphicFrameLocks xmlns:a="http://schemas.openxmlformats.org/drawingml/2006/main" noChangeAspect="1"/>
+            </wp:cNvGraphicFramePr>
+            <a:graphic xmlns:a="http://schemas.openxmlformats.org/drawingml/2006/main">
+              <a:graphicData uri="http://schemas.openxmlformats.org/drawingml/2006/picture">
+                <pic:pic xmlns:pic="http://schemas.openxmlformats.org/drawingml/2006/picture">
+                  <pic:nvPicPr>
+                    <pic:cNvPr id="1114742630" name="Picture 1114742630"/>
+                    <pic:cNvPicPr/>
+                  </pic:nvPicPr>
+                  <pic:blipFill>
+                    <a:blip r:embed="rId19"/>
+                    <a:stretch>
+                      <a:fillRect/>
+                    </a:stretch>
+                  </pic:blipFill>
+                  <pic:spPr>
+                    <a:xfrm>
+                      <a:off x="0" y="0"/>
+                      <a:ext cx="6455410" cy="4032250"/>
+                    </a:xfrm>
+                    <a:prstGeom prst="rect">
+                      <a:avLst/>
+                    </a:prstGeom>
+                  </pic:spPr>
+                </pic:pic>
+              </a:graphicData>
+            </a:graphic>
+          </wp:inline>
+        </w:drawing>
+      </w:r>
+    </w:p>
+    <w:p>
+      <w:pPr>
+        <w:pStyle w:val="ListBullet"/>
+        <w:numPr>
+          <w:ilvl w:val="0"/>
+          <w:numId w:val="0"/>
+        </w:numPr>
+        <w:spacing w:after="40"/>
+        <w:ind w:left="360" w:hanging="360"/>
+        <w:rPr>
+          <w:noProof/>
+        </w:rPr>
+      </w:pPr>
+    </w:p>
+    <w:p>
+      <w:pPr>
+        <w:pStyle w:val="ListBullet"/>
+        <w:numPr>
+          <w:ilvl w:val="0"/>
+          <w:numId w:val="0"/>
+        </w:numPr>
+        <w:spacing w:after="40"/>
+        <w:ind w:left="360" w:hanging="360"/>
+      </w:pPr>
+      <w:r>
+        <w:rPr>
+          <w:noProof/>
+        </w:rPr>
         <w:lastRenderedPageBreak/>
         <w:drawing>
           <wp:inline distT="0" distB="0" distL="0" distR="0" wp14:anchorId="40864FBD" wp14:editId="0DDCC9F6">
@@ -2627,7 +2500,7 @@
                     <pic:cNvPicPr/>
                   </pic:nvPicPr>
                   <pic:blipFill>
-                    <a:blip r:embed="rId19"/>
+                    <a:blip r:embed="rId20"/>
                     <a:stretch>
                       <a:fillRect/>
                     </a:stretch>
@@ -2884,7 +2757,7 @@
                     <pic:cNvPicPr/>
                   </pic:nvPicPr>
                   <pic:blipFill>
-                    <a:blip r:embed="rId20"/>
+                    <a:blip r:embed="rId21"/>
                     <a:stretch>
                       <a:fillRect/>
                     </a:stretch>
@@ -2953,17 +2826,8 @@
           <w:sz w:val="22"/>
         </w:rPr>
         <w:br/>
-        <w:t xml:space="preserve">python -m </w:t>
+        <w:t>python -m src.train</w:t>
       </w:r>
-      <w:proofErr w:type="gramStart"/>
-      <w:r>
-        <w:rPr>
-          <w:rFonts w:ascii="Consolas" w:hAnsi="Consolas"/>
-          <w:sz w:val="22"/>
-        </w:rPr>
-        <w:t>src.train</w:t>
-      </w:r>
-      <w:proofErr w:type="gramEnd"/>
       <w:r>
         <w:rPr>
           <w:rFonts w:ascii="Consolas" w:hAnsi="Consolas"/>
@@ -2986,23 +2850,7 @@
           <w:sz w:val="22"/>
         </w:rPr>
         <w:br/>
-        <w:t>docker build -t heart-disease-</w:t>
-      </w:r>
-      <w:proofErr w:type="gramStart"/>
-      <w:r>
-        <w:rPr>
-          <w:rFonts w:ascii="Consolas" w:hAnsi="Consolas"/>
-          <w:sz w:val="22"/>
-        </w:rPr>
-        <w:t>api:latest</w:t>
-      </w:r>
-      <w:proofErr w:type="gramEnd"/>
-      <w:r>
-        <w:rPr>
-          <w:rFonts w:ascii="Consolas" w:hAnsi="Consolas"/>
-          <w:sz w:val="22"/>
-        </w:rPr>
-        <w:t xml:space="preserve"> .</w:t>
+        <w:t>docker build -t heart-disease-api:latest .</w:t>
       </w:r>
       <w:r>
         <w:rPr>
@@ -3010,39 +2858,7 @@
           <w:sz w:val="22"/>
         </w:rPr>
         <w:br/>
-        <w:t>kubectl apply -f .\k8s\</w:t>
-      </w:r>
-      <w:proofErr w:type="spellStart"/>
-      <w:r>
-        <w:rPr>
-          <w:rFonts w:ascii="Consolas" w:hAnsi="Consolas"/>
-          <w:sz w:val="22"/>
-        </w:rPr>
-        <w:t>deployment.yaml</w:t>
-      </w:r>
-      <w:proofErr w:type="spellEnd"/>
-      <w:r>
-        <w:rPr>
-          <w:rFonts w:ascii="Consolas" w:hAnsi="Consolas"/>
-          <w:sz w:val="22"/>
-        </w:rPr>
-        <w:br/>
-      </w:r>
-      <w:proofErr w:type="spellStart"/>
-      <w:r>
-        <w:rPr>
-          <w:rFonts w:ascii="Consolas" w:hAnsi="Consolas"/>
-          <w:sz w:val="22"/>
-        </w:rPr>
-        <w:t>kubectl</w:t>
-      </w:r>
-      <w:proofErr w:type="spellEnd"/>
-      <w:r>
-        <w:rPr>
-          <w:rFonts w:ascii="Consolas" w:hAnsi="Consolas"/>
-          <w:sz w:val="22"/>
-        </w:rPr>
-        <w:t xml:space="preserve"> get pods</w:t>
+        <w:t>kubectl apply -f .\k8s\deployment.yaml</w:t>
       </w:r>
       <w:r>
         <w:rPr>
@@ -3050,22 +2866,7 @@
           <w:sz w:val="22"/>
         </w:rPr>
         <w:br/>
-      </w:r>
-      <w:proofErr w:type="spellStart"/>
-      <w:r>
-        <w:rPr>
-          <w:rFonts w:ascii="Consolas" w:hAnsi="Consolas"/>
-          <w:sz w:val="22"/>
-        </w:rPr>
-        <w:t>kubectl</w:t>
-      </w:r>
-      <w:proofErr w:type="spellEnd"/>
-      <w:r>
-        <w:rPr>
-          <w:rFonts w:ascii="Consolas" w:hAnsi="Consolas"/>
-          <w:sz w:val="22"/>
-        </w:rPr>
-        <w:t xml:space="preserve"> get deployments</w:t>
+        <w:t>kubectl get pods</w:t>
       </w:r>
       <w:r>
         <w:rPr>
@@ -3073,22 +2874,7 @@
           <w:sz w:val="22"/>
         </w:rPr>
         <w:br/>
-      </w:r>
-      <w:proofErr w:type="spellStart"/>
-      <w:r>
-        <w:rPr>
-          <w:rFonts w:ascii="Consolas" w:hAnsi="Consolas"/>
-          <w:sz w:val="22"/>
-        </w:rPr>
-        <w:t>kubectl</w:t>
-      </w:r>
-      <w:proofErr w:type="spellEnd"/>
-      <w:r>
-        <w:rPr>
-          <w:rFonts w:ascii="Consolas" w:hAnsi="Consolas"/>
-          <w:sz w:val="22"/>
-        </w:rPr>
-        <w:t xml:space="preserve"> get services</w:t>
+        <w:t>kubectl get deployments</w:t>
       </w:r>
       <w:r>
         <w:rPr>
@@ -3096,38 +2882,15 @@
           <w:sz w:val="22"/>
         </w:rPr>
         <w:br/>
+        <w:t>kubectl get services</w:t>
       </w:r>
-      <w:proofErr w:type="spellStart"/>
       <w:r>
         <w:rPr>
           <w:rFonts w:ascii="Consolas" w:hAnsi="Consolas"/>
           <w:sz w:val="22"/>
         </w:rPr>
-        <w:t>kubectl</w:t>
-      </w:r>
-      <w:proofErr w:type="spellEnd"/>
-      <w:r>
-        <w:rPr>
-          <w:rFonts w:ascii="Consolas" w:hAnsi="Consolas"/>
-          <w:sz w:val="22"/>
-        </w:rPr>
-        <w:t xml:space="preserve"> port-forward service/heart-disease-</w:t>
-      </w:r>
-      <w:proofErr w:type="spellStart"/>
-      <w:r>
-        <w:rPr>
-          <w:rFonts w:ascii="Consolas" w:hAnsi="Consolas"/>
-          <w:sz w:val="22"/>
-        </w:rPr>
-        <w:t>api</w:t>
-      </w:r>
-      <w:proofErr w:type="spellEnd"/>
-      <w:r>
-        <w:rPr>
-          <w:rFonts w:ascii="Consolas" w:hAnsi="Consolas"/>
-          <w:sz w:val="22"/>
-        </w:rPr>
-        <w:t xml:space="preserve"> 8081:8000</w:t>
+        <w:br/>
+        <w:t>kubectl port-forward service/heart-disease-api 8081:8000</w:t>
       </w:r>
     </w:p>
     <w:p>
@@ -3176,7 +2939,7 @@
         </w:rPr>
         <w:t>GitHub repository:</w:t>
       </w:r>
-      <w:hyperlink r:id="rId21" w:history="1">
+      <w:hyperlink r:id="rId22" w:history="1">
         <w:r>
           <w:rPr>
             <w:rStyle w:val="Hyperlink"/>
@@ -3223,17 +2986,13 @@
           <w:bottom w:val="single" w:sz="4" w:space="1" w:color="auto"/>
           <w:right w:val="single" w:sz="4" w:space="4" w:color="auto"/>
         </w:pBdr>
-        <w:rPr>
-          <w:sz w:val="22"/>
-        </w:rPr>
-      </w:pPr>
-      <w:hyperlink r:id="rId22" w:history="1">
+      </w:pPr>
+      <w:hyperlink r:id="rId23" w:history="1">
         <w:r>
           <w:rPr>
             <w:rStyle w:val="Hyperlink"/>
-            <w:sz w:val="22"/>
           </w:rPr>
-          <w:t>https://github.com/3121kartikikhoje/MLOps-Heart-Disease-Project/tree/78ee9fb94fde680b23c74514652f64888c436d27/reports/evidence</w:t>
+          <w:t>https://github.com/3121kartikikhoje/MLOps-Heart-Disease-Project/tree/2b8c3f874d5b73d2449c88a353a1bbcea1cc4930/reports/evidence</w:t>
         </w:r>
       </w:hyperlink>
     </w:p>
@@ -3245,9 +3004,6 @@
           <w:bottom w:val="single" w:sz="4" w:space="1" w:color="auto"/>
           <w:right w:val="single" w:sz="4" w:space="4" w:color="auto"/>
         </w:pBdr>
-        <w:rPr>
-          <w:sz w:val="22"/>
-        </w:rPr>
       </w:pPr>
     </w:p>
     <w:p>
@@ -3266,9 +3022,100 @@
         <w:rPr>
           <w:sz w:val="22"/>
         </w:rPr>
+        <w:t>Documentation folder-</w:t>
+      </w:r>
+    </w:p>
+    <w:p>
+      <w:pPr>
+        <w:pBdr>
+          <w:top w:val="single" w:sz="4" w:space="1" w:color="auto"/>
+          <w:left w:val="single" w:sz="4" w:space="4" w:color="auto"/>
+          <w:bottom w:val="single" w:sz="4" w:space="1" w:color="auto"/>
+          <w:right w:val="single" w:sz="4" w:space="4" w:color="auto"/>
+        </w:pBdr>
+      </w:pPr>
+      <w:hyperlink r:id="rId24" w:history="1">
+        <w:r>
+          <w:rPr>
+            <w:rStyle w:val="Hyperlink"/>
+          </w:rPr>
+          <w:t>https://github.com/3121kartikikhoje/MLOps-Heart-Disease-Project/tree/2b8c3f874d5b73d2449c88a353a1bbcea1cc4930/reports/documentation</w:t>
+        </w:r>
+      </w:hyperlink>
+    </w:p>
+    <w:p>
+      <w:pPr>
+        <w:pBdr>
+          <w:top w:val="single" w:sz="4" w:space="1" w:color="auto"/>
+          <w:left w:val="single" w:sz="4" w:space="4" w:color="auto"/>
+          <w:bottom w:val="single" w:sz="4" w:space="1" w:color="auto"/>
+          <w:right w:val="single" w:sz="4" w:space="4" w:color="auto"/>
+        </w:pBdr>
+        <w:rPr>
+          <w:sz w:val="22"/>
+        </w:rPr>
+      </w:pPr>
+    </w:p>
+    <w:p>
+      <w:pPr>
+        <w:pBdr>
+          <w:top w:val="single" w:sz="4" w:space="1" w:color="auto"/>
+          <w:left w:val="single" w:sz="4" w:space="4" w:color="auto"/>
+          <w:bottom w:val="single" w:sz="4" w:space="1" w:color="auto"/>
+          <w:right w:val="single" w:sz="4" w:space="4" w:color="auto"/>
+        </w:pBdr>
+        <w:rPr>
+          <w:sz w:val="22"/>
+        </w:rPr>
+      </w:pPr>
+      <w:r>
+        <w:rPr>
+          <w:sz w:val="22"/>
+        </w:rPr>
+        <w:t xml:space="preserve">Video walkthrough link - </w:t>
+      </w:r>
+      <w:hyperlink r:id="rId25" w:history="1">
+        <w:r>
+          <w:rPr>
+            <w:rStyle w:val="Hyperlink"/>
+            <w:sz w:val="22"/>
+          </w:rPr>
+          <w:t>https://drive.google.com/file/d/1LS8GjgLJLhFAwfznoCr8rvhKGSsASCLb/view?usp=sharing</w:t>
+        </w:r>
+      </w:hyperlink>
+    </w:p>
+    <w:p>
+      <w:pPr>
+        <w:pBdr>
+          <w:top w:val="single" w:sz="4" w:space="1" w:color="auto"/>
+          <w:left w:val="single" w:sz="4" w:space="4" w:color="auto"/>
+          <w:bottom w:val="single" w:sz="4" w:space="1" w:color="auto"/>
+          <w:right w:val="single" w:sz="4" w:space="4" w:color="auto"/>
+        </w:pBdr>
+        <w:rPr>
+          <w:sz w:val="22"/>
+        </w:rPr>
+      </w:pPr>
+    </w:p>
+    <w:p>
+      <w:pPr>
+        <w:pBdr>
+          <w:top w:val="single" w:sz="4" w:space="1" w:color="auto"/>
+          <w:left w:val="single" w:sz="4" w:space="4" w:color="auto"/>
+          <w:bottom w:val="single" w:sz="4" w:space="1" w:color="auto"/>
+          <w:right w:val="single" w:sz="4" w:space="4" w:color="auto"/>
+        </w:pBdr>
+        <w:rPr>
+          <w:sz w:val="22"/>
+        </w:rPr>
+      </w:pPr>
+      <w:r>
+        <w:rPr>
+          <w:sz w:val="22"/>
+        </w:rPr>
         <w:t xml:space="preserve">Dataset source: </w:t>
       </w:r>
-      <w:hyperlink r:id="rId23" w:history="1">
+      <w:hyperlink r:id="rId26" w:history="1">
         <w:r>
           <w:rPr>
             <w:rStyle w:val="Hyperlink"/>
@@ -3279,7 +3126,7 @@
       </w:hyperlink>
     </w:p>
     <w:sectPr>
-      <w:footerReference w:type="default" r:id="rId24"/>
+      <w:footerReference w:type="default" r:id="rId27"/>
       <w:pgSz w:w="12240" w:h="15840"/>
       <w:pgMar w:top="893" w:right="1037" w:bottom="893" w:left="1037" w:header="720" w:footer="720" w:gutter="0"/>
       <w:cols w:space="720"/>

</xml_diff>